<commit_message>
10/9 Report improvement Part 1 + Ticket Cancel function.
</commit_message>
<xml_diff>
--- a/apps/incidents/report_templates/event_report_template_v1.docx
+++ b/apps/incidents/report_templates/event_report_template_v1.docx
@@ -309,7 +309,7 @@
                 <w:color w:val="404040"/>
                 <w:sz w:val="23"/>
               </w:rPr>
-              <w:t>{{incident_datetime}}</w:t>
+              <w:t>{{event_occurred_at}}</w:t>
             </w:r>
           </w:p>
         </w:tc>
@@ -425,7 +425,7 @@
                 <w:color w:val="404040"/>
                 <w:sz w:val="21"/>
               </w:rPr>
-              <w:t>{{chk_class_incident}}</w:t>
+              <w:t>{{chk_class_event}}</w:t>
             </w:r>
             <w:r>
               <w:rPr>
@@ -434,7 +434,7 @@
                 <w:color w:val="404040"/>
                 <w:sz w:val="23"/>
               </w:rPr>
-              <w:t xml:space="preserve"> Incident</w:t>
+              <w:t xml:space="preserve"> Event</w:t>
             </w:r>
             <w:r>
               <w:rPr>
@@ -452,7 +452,7 @@
                 <w:color w:val="404040"/>
                 <w:sz w:val="21"/>
               </w:rPr>
-              <w:t>{{chk_class_event}}</w:t>
+              <w:t>{{chk_class_incident}}</w:t>
             </w:r>
             <w:r>
               <w:rPr>
@@ -461,7 +461,7 @@
                 <w:color w:val="404040"/>
                 <w:sz w:val="23"/>
               </w:rPr>
-              <w:t xml:space="preserve"> Event</w:t>
+              <w:t xml:space="preserve"> Incident</w:t>
             </w:r>
           </w:p>
         </w:tc>
@@ -1294,65 +1294,7 @@
                 <w:color w:val="404040"/>
                 <w:sz w:val="23"/>
               </w:rPr>
-              <w:t>1.15 ระบบที่ได้รับผลกระทบ</w:t>
-            </w:r>
-          </w:p>
-        </w:tc>
-        <w:tc>
-          <w:tcPr>
-            <w:tcW w:type="dxa" w:w="6408"/>
-            <w:vAlign w:val="center"/>
-            <w:tcMar>
-              <w:top w:w="28" w:type="dxa"/>
-              <w:start w:w="80" w:type="dxa"/>
-              <w:bottom w:w="28" w:type="dxa"/>
-              <w:end w:w="80" w:type="dxa"/>
-            </w:tcMar>
-          </w:tcPr>
-          <w:p>
-            <w:pPr>
-              <w:spacing w:before="0" w:after="0" w:line="240" w:lineRule="auto"/>
-            </w:pPr>
-            <w:r>
-              <w:rPr>
-                <w:rFonts w:ascii="TH Sarabun New" w:hAnsi="TH Sarabun New" w:cs="TH Sarabun New"/>
-                <w:b w:val="0"/>
-                <w:color w:val="404040"/>
-                <w:sz w:val="23"/>
-              </w:rPr>
-              <w:t>{{system_name}}</w:t>
-            </w:r>
-          </w:p>
-        </w:tc>
-      </w:tr>
-      <w:tr>
-        <w:trPr>
-          <w:cantSplit/>
-        </w:trPr>
-        <w:tc>
-          <w:tcPr>
-            <w:tcW w:type="dxa" w:w="3816"/>
-            <w:vAlign w:val="center"/>
-            <w:tcMar>
-              <w:top w:w="28" w:type="dxa"/>
-              <w:start w:w="80" w:type="dxa"/>
-              <w:bottom w:w="28" w:type="dxa"/>
-              <w:end w:w="80" w:type="dxa"/>
-            </w:tcMar>
-            <w:shd w:val="clear" w:fill="F2F2F2"/>
-          </w:tcPr>
-          <w:p>
-            <w:pPr>
-              <w:spacing w:before="0" w:after="0" w:line="240" w:lineRule="auto"/>
-            </w:pPr>
-            <w:r>
-              <w:rPr>
-                <w:rFonts w:ascii="TH Sarabun New" w:hAnsi="TH Sarabun New" w:cs="TH Sarabun New"/>
-                <w:b/>
-                <w:color w:val="404040"/>
-                <w:sz w:val="23"/>
-              </w:rPr>
-              <w:t>1.16 เรื่องที่ดำเนินการแล้ว</w:t>
+              <w:t>1.15 เรื่องที่ดำเนินการแล้ว</w:t>
             </w:r>
           </w:p>
         </w:tc>
@@ -1410,7 +1352,7 @@
                 <w:color w:val="404040"/>
                 <w:sz w:val="23"/>
               </w:rPr>
-              <w:t>1.17 การที่จะดำเนินการลำดับถัดไป</w:t>
+              <w:t>1.16 การที่จะดำเนินการลำดับถัดไป</w:t>
             </w:r>
           </w:p>
         </w:tc>
@@ -1468,7 +1410,7 @@
                 <w:color w:val="404040"/>
                 <w:sz w:val="23"/>
               </w:rPr>
-              <w:t>1.18 ผู้รายงาน</w:t>
+              <w:t>1.17 ผู้รายงาน</w:t>
             </w:r>
           </w:p>
         </w:tc>
@@ -1526,7 +1468,7 @@
                 <w:color w:val="404040"/>
                 <w:sz w:val="23"/>
               </w:rPr>
-              <w:t>1.19 แหล่งข้อมูล</w:t>
+              <w:t>1.18 แหล่งข้อมูล</w:t>
             </w:r>
           </w:p>
         </w:tc>

</xml_diff>